<commit_message>
docs: update Master Prompt spec (Right XSHUT remapped from GPIO 14 to GPIO 5)
</commit_message>
<xml_diff>
--- a/MICROMOUSE_MASTER_PROMPT.docx
+++ b/MICROMOUSE_MASTER_PROMPT.docx
@@ -838,7 +838,7 @@
     </w:p>
     <w:p>
       <w:r>
-        <w:t>| Right | GPIO 14 | `0x32` |</w:t>
+        <w:t>| Right | GPIO 5 | `0x32` |</w:t>
       </w:r>
     </w:p>
     <w:p>
@@ -853,7 +853,7 @@
     </w:p>
     <w:p>
       <w:r>
-        <w:t>constexpr uint8_t PIN_XSHUT_RIGHT = 14;</w:t>
+        <w:t>constexpr uint8_t PIN_XSHUT_RIGHT = 5;</w:t>
       </w:r>
     </w:p>
     <w:p>
@@ -2912,7 +2912,7 @@
     </w:p>
     <w:p>
       <w:r>
-        <w:t>Right = GPIO14 → 0x32</w:t>
+        <w:t>Right = GPIO5 → 0x32</w:t>
       </w:r>
     </w:p>
     <w:p>

</xml_diff>

<commit_message>
docs: correct ToF pins to Front=GPIO5 and Right=GPIO11
</commit_message>
<xml_diff>
--- a/MICROMOUSE_MASTER_PROMPT.docx
+++ b/MICROMOUSE_MASTER_PROMPT.docx
@@ -833,12 +833,12 @@
     </w:p>
     <w:p>
       <w:r>
-        <w:t>| Front | GPIO 11 | `0x31` |</w:t>
-      </w:r>
-    </w:p>
-    <w:p>
-      <w:r>
-        <w:t>| Right | GPIO 5 | `0x32` |</w:t>
+        <w:t>| Front | GPIO 5 | `0x31` |</w:t>
+      </w:r>
+    </w:p>
+    <w:p>
+      <w:r>
+        <w:t>| Right | GPIO 11 | `0x32` |</w:t>
       </w:r>
     </w:p>
     <w:p>
@@ -848,12 +848,12 @@
     </w:p>
     <w:p>
       <w:r>
-        <w:t>constexpr uint8_t PIN_XSHUT_FRONT = 11;</w:t>
-      </w:r>
-    </w:p>
-    <w:p>
-      <w:r>
-        <w:t>constexpr uint8_t PIN_XSHUT_RIGHT = 5;</w:t>
+        <w:t>constexpr uint8_t PIN_XSHUT_FRONT = 5;</w:t>
+      </w:r>
+    </w:p>
+    <w:p>
+      <w:r>
+        <w:t>constexpr uint8_t PIN_XSHUT_RIGHT = 11;</w:t>
       </w:r>
     </w:p>
     <w:p>
@@ -2907,12 +2907,12 @@
     </w:p>
     <w:p>
       <w:r>
-        <w:t>Front = GPIO11 → 0x31</w:t>
-      </w:r>
-    </w:p>
-    <w:p>
-      <w:r>
-        <w:t>Right = GPIO5 → 0x32</w:t>
+        <w:t>Front = GPIO5 → 0x31</w:t>
+      </w:r>
+    </w:p>
+    <w:p>
+      <w:r>
+        <w:t>Right = GPIO11 → 0x32</w:t>
       </w:r>
     </w:p>
     <w:p>

</xml_diff>